<commit_message>
Synchronize verified IEEE references [1-25] and finalize bidirectional in-text citations
</commit_message>
<xml_diff>
--- a/READYTOSUBMIT/2_Research_Paper_Word/IEEE_BAMKS_D_Research_Paper.docx
+++ b/READYTOSUBMIT/2_Research_Paper_Word/IEEE_BAMKS_D_Research_Paper.docx
@@ -242,7 +242,7 @@
           <w:color w:val="1E293B"/>
           <w:sz w:val="20"/>
         </w:rPr>
-        <w:t>The contemporary healthcare ecosystem is experiencing an unprecedented paradigm shift driven by the rapid deployment of Internet of Medical Things (IoMT) devices. Continuous physiological telemetry streams—including 12-lead electrocardiograms (ECG), photoplethysmography (PPG) vitals, ambulatory blood pressure feeds, and high-resolution neuroimaging scans—are captured at the clinical edge and transmitted to cloud repositories for diagnostic archiving and collaborative clinician review [1], [2]. While cloud outsourcing provides virtually limitless computational scalability and fault-tolerant storage, it concurrently introduces acute data privacy and regulatory compliance concerns. Electronic Health Records (EHR) contain highly sensitive diagnostic narratives and protected health information (PHI) governed by strict regulatory frameworks such as the Health Insurance Portability and Accountability Act (HIPAA) in the United States and the General Data Protection Regulation (GDPR) in the European Union [1]. Consequently, medical records must be encrypted under robust cryptographic primitives prior to transmission beyond the hospital boundary.</w:t>
+        <w:t>The contemporary healthcare ecosystem is experiencing an unprecedented paradigm shift driven by the rapid deployment of Internet of Medical Things (IoMT) devices. Continuous physiological telemetry streams—including 12-lead electrocardiograms (ECG), photoplethysmography (PPG) vitals, ambulatory blood pressure feeds, and high-resolution neuroimaging scans—are captured at the clinical edge and transmitted to cloud repositories for diagnostic archiving and collaborative clinician review [1], [2], [25]. While cloud outsourcing provides virtually limitless computational scalability and fault-tolerant storage, it concurrently introduces acute data privacy and regulatory compliance concerns. Electronic Health Records (EHR) contain highly sensitive diagnostic narratives and protected health information (PHI) governed by strict regulatory frameworks such as the Health Insurance Portability and Accountability Act (HIPAA) in the United States and the General Data Protection Regulation (GDPR) in the European Union [1]. Consequently, medical records must be encrypted under robust cryptographic primitives prior to transmission beyond the hospital boundary.</w:t>
       </w:r>
     </w:p>
     <w:p>
@@ -414,7 +414,30 @@
           <w:color w:val="1E293B"/>
           <w:sz w:val="20"/>
         </w:rPr>
-        <w:t>Attribute-Based Keyword Search (ABKS) systems have evolved across multiple architectural axes. Monotonic tree structures and Linear Secret Sharing Schemes (LSSS) were introduced to enhance policy expressiveness [3], [5]. Multi-authority ABKS schemes (MA-ABKS), pioneered by Chase [13] and Lewko and Waters [14], distributed attribute authority across independent administrative domains, preventing any single entity from compromising the global master secret. Recent research has extensively integrated blockchain ledgers to eliminate single points of failure and enforce verifiable query computation [15], [16]. Liu et al. [17] developed EMK-ABSE for edge-assisted IoT multi-keyword search. Su, Zhang, and Mu [18] proposed BA-RMKABSE, introducing smart contract-assisted keyword updates. Zhang et al. [19] formulated ABCKS, establishing conjunctive multi-keyword search with verifiable fairness across consortium ledgers. Liang et al. [20] introduced VMSE, supporting verifiable dynamic keyword updating via blockchain accumulators. Cheng et al. [1] synthesized these domains in BAMKS, introducing collaborative indexing and aggregated SNIZK result verification, yet left atomic single-file operations unresolved.</w:t>
+        <w:t>Attribute-Based Keyword Search (ABKS) systems have evolved across multiple architectural axes. Monotonic tree structures and Linear Secret Sharing Schemes (LSSS) were introduced to enhance policy expressiveness [3], [5]. Multi-authority ABKS schemes (MA-ABKS), pioneered by Chase [13] and Lewko and Waters [14], distributed attribute authority across independent administrative domains, preventing any single entity from compromising the global master secret. Recent research has extensively integrated blockchain ledgers to eliminate single points of failure and enforce verifiable query computation [15], [16]. Liu et al. [17] developed EMK-ABSE for edge-assisted IoT multi-keyword search. Su, Zhang, and Mu [18] proposed BA-RMKABSE, introducing smart contract-assisted keyword updates. Zhang et al. [19] formulated ABCKS, establishing conjunctive multi-keyword search with verifiable fairness across consortium ledgers. Liang et al. [7] introduced VMSE, supporting verifiable dynamic keyword updating in multi-user cloud environments. Cheng et al. [1] synthesized these domains in BAMKS, introducing collaborative indexing and aggregated SNIZK result verification, yet left atomic single-file operations unresolved.</w:t>
+      </w:r>
+    </w:p>
+    <w:p>
+      <w:pPr>
+        <w:spacing w:before="0" w:after="100" w:line="276" w:lineRule="auto"/>
+        <w:jc w:val="both"/>
+      </w:pPr>
+      <w:r>
+        <w:rPr>
+          <w:rFonts w:ascii="Times New Roman" w:hAnsi="Times New Roman"/>
+          <w:b/>
+          <w:color w:val="0F172A"/>
+          <w:sz w:val="20"/>
+        </w:rPr>
+        <w:t xml:space="preserve">D. Foundations of Attribute-Based &amp; Predicate Cryptosystems: </w:t>
+      </w:r>
+      <w:r>
+        <w:rPr>
+          <w:rFonts w:ascii="Times New Roman" w:hAnsi="Times New Roman"/>
+          <w:color w:val="1E293B"/>
+          <w:sz w:val="20"/>
+        </w:rPr>
+        <w:t>The theoretical foundation of fine-grained attribute-based access control originated from Fuzzy Identity-Based Encryption formulated by Sahai and Waters [24], which relaxed exact identity matching to error-tolerant set overlaps. Goyal et al. [20] subsequently established Key-Policy Attribute-Based Encryption (KP-ABE), allowing ciphertext attributes to be authorized under monotonic access trees embedded within user secret keys. To support expressive negative attributes and dynamic revocation constraints, Ostrovsky, Sahai, and Waters [21] introduced non-monotonic access structures. Katz, Sahai, and Waters [22] generalized attribute authorization into predicate encryption, supporting inner-product evaluations, polynomials, and disjunctions over encrypted data. Furthermore, in dynamic broadcast and multi-user environments, Delerablée [23] introduced dynamic threshold public-key encryption to maintain constant-size ciphertexts and private keys during ad-hoc user group updates.</w:t>
       </w:r>
     </w:p>
     <w:p>
@@ -1371,7 +1394,7 @@
                 <w:color w:val="1E293B"/>
                 <w:sz w:val="17"/>
               </w:rPr>
-              <w:t>VMSE [20]</w:t>
+              <w:t>VMSE [7]</w:t>
             </w:r>
           </w:p>
         </w:tc>

</xml_diff>